<commit_message>
2Chronicles 2nd deep review: 9 EN/KO restores (sin-school, captains, search party, arrogant Ahaz, firm foundation, commended Levites, qualified priests, dedication, seances, Josiah donation fix)
</commit_message>
<xml_diff>
--- a/gdocs_build/2Chronicles.docx
+++ b/gdocs_build/2Chronicles.docx
@@ -16037,7 +16037,7 @@
               <w:rPr>
                 <w:sz w:val="18"/>
               </w:rPr>
-              <w:t>The people of Jerusalem made Ahaziah, the youngest of Jehoram's sons, king in his place — the raiders who came with the Arabs against the camp had killed all the older sons. That's why Ahaziah, son of Jehoram, became king of Judah. Ahaziah was twenty-two years old when he became king, and he ruled in Jerusalem for one year. His mother was Athaliah, the granddaughter of Omri. He lived badly, just like the Ahab family. His mother gave him, as usual, bad advice. He did evil in the eyes of God, just like the Ahab family. They were his counselors after the death of his father — they were the reason he was such a disaster. But then, at their counsel, he joined Joram, son of Ahab, king of Israel, in war against Hazael, king of Aram, at Ramoth Gilead. Joram was wounded by the Arameans, and he went to Jezreel to recover from the wounds he got in Ramah in the war against Hazael, king of Aram. Ahaziah, son of Jehoram and king of Judah, went down to visit Joram, son of Ahab, in Jezreel to see how he was doing.</w:t>
+              <w:t>The people of Jerusalem made Ahaziah, the youngest of Jehoram's sons, king in his place — the raiders who came with the Arabs against the camp had killed all the older sons. That's why Ahaziah, son of Jehoram, became king of Judah. Ahaziah was twenty-two years old when he became king, and he ruled in Jerusalem for one year. His mother was Athaliah, the granddaughter of Omri. He lived badly, just like the Ahab family. His mother gave him, as usual, bad advice. He did evil in the eyes of God, just like the Ahab family. They were his counselors after the death of his father — he went to Ahab's school of sin and graduated with a degree in doom. But then, at their counsel, he joined Joram, son of Ahab, king of Israel, in war against Hazael, king of Aram, at Ramoth Gilead. Joram was wounded by the Arameans, and he went to Jezreel to recover from the wounds he got in Ramah in the war against Hazael, king of Aram. Ahaziah, son of Jehoram and king of Judah, went down to visit Joram, son of Ahab, in Jezreel to see how he was doing.</w:t>
             </w:r>
           </w:p>
         </w:tc>
@@ -16060,7 +16060,7 @@
               <w:rPr>
                 <w:sz w:val="18"/>
               </w:rPr>
-              <w:t>예루살렘 사람들이 여호람의 막내 아들 아하시야를 왕으로 세웠어. 아라비아 사람들과 함께 진영을 치러 온 약탈자들이 나이 많은 아들들을 모두 죽였거든. 그래서 여호람의 아들 아하시야가 유다 왕이 됐지. 아하시야는 왕이 될 때 22살이었고 예루살렘에서 1년 동안 다스렸어. 어머니는 오므리의 손녀 아달랴였지. 아합 집안처럼 나쁘게 살았어. 어머니가 평소대로 나쁜 조언을 해줬거든. 아합 집안처럼 하나님 눈에 악을 행했어. 아버지가 죽은 후 그들이 그의 조언자가 됐지. 그가 재앙이 된 이유야. 그러다 그들의 조언대로 아합의 아들 이스라엘 왕 요람과 함께 길르앗 라못에서 아람 왕 하사엘과 전쟁했어. 요람이 아람 사람들에게 부상당했고, 라맛에서 아람 왕 하사엘과의 전쟁에서 입은 상처를 치료하려고 이스르엘로 내려갔지. 여호람의 아들 유다 왕 아하시야가 이스르엘로 내려가 아합의 아들 요람을 문병했어.</w:t>
+              <w:t>예루살렘 사람들이 여호람의 막내 아들 아하시야를 왕으로 세웠어. 아라비아 사람들과 함께 진영을 치러 온 약탈자들이 나이 많은 아들들을 모두 죽였거든. 그래서 여호람의 아들 아하시야가 유다 왕이 됐지. 아하시야는 왕이 될 때 22살이었고 예루살렘에서 1년 동안 다스렸어. 어머니는 오므리의 손녀 아달랴였지. 아합 집안처럼 나쁘게 살았어. 어머니가 평소대로 나쁜 조언을 해줬거든. 아합 집안처럼 하나님 눈에 악을 행했어. 아버지가 죽은 후 그들이 그의 조언자가 됐지. 아합의 죄악 학교에 들어가 재앙 학위를 따고 졸업한 셈이야. 그러다 그들의 조언대로 아합의 아들 이스라엘 왕 요람과 함께 길르앗 라못에서 아람 왕 하사엘과 전쟁했어. 요람이 아람 사람들에게 부상당했고, 라맛에서 아람 왕 하사엘과의 전쟁에서 입은 상처를 치료하려고 이스르엘로 내려갔지. 여호람의 아들 유다 왕 아하시야가 이스르엘로 내려가 아합의 아들 요람을 문병했어.</w:t>
             </w:r>
           </w:p>
         </w:tc>
@@ -16116,7 +16116,7 @@
               <w:rPr>
                 <w:sz w:val="18"/>
               </w:rPr>
-              <w:t>When Ahaziah arrived at Jezreel to visit Joram, it turned out to be a fatal mistake — God was behind it. There he met Jehu son of Nimshi, whom God had chosen to finish off the Ahab family. Jehu met up with some relatives of Ahaziah, the king of Judah. “Who are you?” he asked. “Nephews of Ahaziah,” they said. “We've come to visit the king's sons and the queen's sons.” They were captured and then killed in the cistern at Beth Eked — forty-two of them. He didn't leave one alive. Ahaziah went into hiding in Samaria. But they found him and brought him to Jehu. They killed him and then buried him. They said, “After all, he is the grandson of Jehoshaphat, who gave his whole life to seeking God.” But there was no one in Ahaziah's family strong enough to rule the kingdom.</w:t>
+              <w:t>When Ahaziah arrived at Jezreel to visit Joram, it turned out to be a fatal mistake — God was behind it. There he met Jehu son of Nimshi, whom God had chosen to finish off the Ahab family. Jehu met up with the captains of Judah and some relatives of Ahaziah, the king of Judah. “Who are you?” he asked. “Nephews of Ahaziah,” they said. “We've come to visit the king's sons and the queen's sons.” They were captured and then killed in the cistern at Beth Eked — forty-two of them. He didn't leave one alive. Then he sent out a search party looking for Ahaziah himself. They found him hiding out in Samaria and hauled him back to Jehu. They killed him and then buried him. They said, “After all, he is the grandson of Jehoshaphat, who gave his whole life to seeking God.” But there was no one in Ahaziah's family strong enough to rule the kingdom.</w:t>
             </w:r>
           </w:p>
         </w:tc>
@@ -16139,7 +16139,7 @@
               <w:rPr>
                 <w:sz w:val="18"/>
               </w:rPr>
-              <w:t>아하시야가 요람을 문병하러 이스르엘에 도착했는데, 치명적 실수가 됐어. 하나님이 그 뒤에 계셨거든. 거기서 님시의 아들 예후를 만났지. 하나님이 아합 집안을 끝내려고 선택하신 사람. 예후가 유다 왕 아하시야의 친척 몇 명을 만났어. “너희는 누구냐?” 물었지. “아하시야의 조카들입니다,” 그들이 말했어. “왕자들과 왕후의 아들들을 문병하러 왔습니다.” 붙잡혀 벧에겟 우물에서 죽임을 당했어. 42명이었지. 한 명도 살려두지 않았어. 아하시야는 사마리아에 숨었어. 하지만 찾아내 예후에게 끌고 왔지. 죽이고 묻었어. 사람들이 말했지. “어쨌든 그는 여호사밧의 손자야. 평생 하나님을 찾는 데 바친 사람이야.” 하지만 아하시야 가문에는 나라를 다스릴 만한 강한 자가 없었어.</w:t>
+              <w:t>아하시야가 요람을 문병하러 이스르엘에 도착했는데, 치명적 실수가 됐어. 하나님이 그 뒤에 계셨거든. 거기서 님시의 아들 예후를 만났지. 하나님이 아합 집안을 끝내려고 선택하신 사람. 예후가 유다의 지휘관들과 아하시야 왕의 친척 몇 명을 만났어. “너희는 누구냐?” 물었지. “아하시야의 조카들입니다,” 그들이 말했어. “왕자들과 왕후의 아들들을 문병하러 왔습니다.” 붙잡혀 벧에겟 우물에서 죽임을 당했어. 42명이었지. 한 명도 살려두지 않았어. 예후가 아하시야를 찾으려고 수색대를 보냈어. 사마리아에 숨어 있던 그를 찾아내 예후에게 끌고 왔지. 죽이고 묻었어. 사람들이 말했지. “어쨌든 그는 여호사밧의 손자야. 평생 하나님을 찾는 데 바친 사람이야.” 하지만 아하시야 가문에는 나라를 다스릴 만한 강한 자가 없었어.</w:t>
             </w:r>
           </w:p>
         </w:tc>
@@ -20492,7 +20492,7 @@
               <w:rPr>
                 <w:sz w:val="18"/>
               </w:rPr>
-              <w:t>At about that time, King Ahaz sent to the king of Assyria asking for personal assistance. The Edomites had come back and given Judah a bad beating, taking off a bunch of captives. Adding to the misery, the Philistines were raiding towns in the foothills and the Negev of Judah. They captured Beth Shemesh, Aijalon, Gederoth, Soco and its villages, Timnah and its villages, and Gimzo and its villages, and settled down there. God's affliction on Judah was because of the leadership of Ahaz king of Israel — he'd gotten the whole country into a moral mess and had turned his back on God. Then, to add insult to injury, Tiglath-Pileser the king of Assyria came to him anyway and put the squeeze on him instead of helping him. Ahaz took treasure from The Temple of God, the royal palace, and the princes, and gave it to the king of Assyria as a bribe — but it didn't do any good.</w:t>
+              <w:t>At about that time, King Ahaz sent to the king of Assyria asking for personal assistance. The Edomites had come back and given Judah a bad beating, taking off a bunch of captives. Adding to the misery, the Philistines were raiding towns in the foothills and the Negev of Judah. They captured Beth Shemesh, Aijalon, Gederoth, Soco and its villages, Timnah and its villages, and Gimzo and its villages, and settled down there. God's affliction on Judah was because of the leadership of arrogant King Ahaz — he'd gotten the whole country into a moral mess and had turned his back on God. Then, to add insult to injury, Tiglath-Pileser the king of Assyria came to him anyway and put the squeeze on him instead of helping him. Ahaz took treasure from The Temple of God, the royal palace, and the princes, and gave it to the king of Assyria as a bribe — but it didn't do any good.</w:t>
             </w:r>
           </w:p>
         </w:tc>
@@ -20515,7 +20515,7 @@
               <w:rPr>
                 <w:sz w:val="18"/>
               </w:rPr>
-              <w:t>그 무렵 아하스 왕이 앗수르 왕에게 개인적 도움을 요청했어. 에돔 사람들이 돌아와 유다를 심하게 두들겨 포로를 잔뜩 잡아갔거든. 설상가상으로 블레셋이 유다 구릉과 네게브의 성읍들을 약탈했어. 벧세메스, 아얄론, 그데롯, 소고와 그 마을들, 딤나와 그 마을들, 김소와 그 마을들을 점령하고 정착했지. 하나님이 유다에 내리신 고난은 이스라엘 왕 아하스의 지도력 때문이었어. 온 나라를 도덕적 엉망으로 만들고 하나님께 등을 돌렸거든. 그런데 모욕에 상처를 더하듯, 앗수르 왕 디글랏빌레셀이 와서 돕기는커녕 오히려 압박했어. 아하스가 하나님의 성전과 왕궁과 방백들의 보물을 가져다 앗수르 왕에게 뇌물로 바쳤지만 아무 소용없었지.</w:t>
+              <w:t>그 무렵 아하스 왕이 앗수르 왕에게 개인적 도움을 요청했어. 에돔 사람들이 돌아와 유다를 심하게 두들겨 포로를 잔뜩 잡아갔거든. 설상가상으로 블레셋이 유다 구릉과 네게브의 성읍들을 약탈했어. 벧세메스, 아얄론, 그데롯, 소고와 그 마을들, 딤나와 그 마을들, 김소와 그 마을들을 점령하고 정착했지. 하나님이 유다에 내리신 고난은 거만한 아하스 왕의 지도력 때문이었어. 온 나라를 도덕적 엉망으로 만들고 하나님께 등을 돌렸거든. 그런데 모욕에 상처를 더하듯, 앗수르 왕 디글랏빌레셀이 와서 돕기는커녕 오히려 압박했어. 아하스가 하나님의 성전과 왕궁과 방백들의 보물을 가져다 앗수르 왕에게 뇌물로 바쳤지만 아무 소용없었지.</w:t>
             </w:r>
           </w:p>
         </w:tc>
@@ -21464,7 +21464,7 @@
               <w:rPr>
                 <w:sz w:val="18"/>
               </w:rPr>
-              <w:t>Hezekiah and the people were overjoyed — what God had done for the people! And it happened in no time at all.</w:t>
+              <w:t>Hezekiah and the people were overjoyed — thankful that God had set their lives on a firm foundation! And it happened in no time at all.</w:t>
             </w:r>
           </w:p>
         </w:tc>
@@ -21487,7 +21487,7 @@
               <w:rPr>
                 <w:sz w:val="18"/>
               </w:rPr>
-              <w:t>히스기야와 백성이 크게 기뻐했어. 하나님이 백성을 위해 하신 일을! 그리고 눈 깜짝할 사이에 일어났어.</w:t>
+              <w:t>히스기야와 백성이 크게 기뻐했어. 하나님이 백성의 삶을 든든한 반석 위에 세워주신 거야! 그것도 눈 깜짝할 사이에.</w:t>
             </w:r>
           </w:p>
         </w:tc>
@@ -22073,7 +22073,7 @@
               <w:rPr>
                 <w:sz w:val="18"/>
               </w:rPr>
-              <w:t>The Israelites in Jerusalem celebrated the Feast of Unraised Bread for seven days with great joy. The Levites and priests praised God day after day, filling the air with music. Hezekiah rallied the Levites who were skillful at serving God. They celebrated the feast for seven days, sacrificing Peace-Offerings, and giving thanks to the God of their ancestors.</w:t>
+              <w:t>The Israelites in Jerusalem celebrated the Feast of Unraised Bread for seven days with great joy. The Levites and priests praised God day after day, filling the air with music. Hezekiah praised the Levites for the awesome way they had led the people in worshiping God. They celebrated the feast for seven days, sacrificing Peace-Offerings, and giving thanks to the God of their ancestors.</w:t>
             </w:r>
           </w:p>
         </w:tc>
@@ -22096,7 +22096,7 @@
               <w:rPr>
                 <w:sz w:val="18"/>
               </w:rPr>
-              <w:t>예루살렘에 있는 이스라엘 사람들이 7일 동안 큰 기쁨으로 무교절을 지켰어. 레위인들과 제사장들이 날마다 하나님을 찬양하며 음악으로 공기를 가득 채웠지. 히스기야가 하나님 섬기기에 능숙한 레위인들을 격려했어. 7일 동안 절기를 지키며 화목제를 드리고 조상들의 하나님께 감사했지.</w:t>
+              <w:t>예루살렘에 있는 이스라엘 사람들이 7일 동안 큰 기쁨으로 무교절을 지켰어. 레위인들과 제사장들이 날마다 하나님을 찬양하며 음악으로 공기를 가득 채웠지. 히스기야가 백성을 예배로 이끈 레위인들의 훌륭한 모습을 칭찬했어. 7일 동안 절기를 지키며 화목제를 드리고 조상들의 하나님께 감사했지.</w:t>
             </w:r>
           </w:p>
         </w:tc>
@@ -22215,7 +22215,7 @@
               <w:rPr>
                 <w:sz w:val="18"/>
               </w:rPr>
-              <w:t>Hezekiah king of Judah gave the congregation a thousand bulls and seven thousand sheep for the offerings, and the leaders also gave the congregation a thousand bulls and ten thousand sheep. A great number of priests consecrated themselves. The whole congregation of Judah, the priests, the Levites, the congregation that came from Israel, and the resident aliens from both the country of Israel and the country of Judah, celebrated. It was a great celebration in Jerusalem, unequaled since the days of Solomon son of David king of Israel.</w:t>
+              <w:t>Hezekiah king of Judah gave the congregation a thousand bulls and seven thousand sheep for the offerings, and the leaders also gave the congregation a thousand bulls and ten thousand sheep. A great number of priests consecrated themselves — qualified and well-prepared. The whole congregation of Judah, the priests, the Levites, the congregation that came from Israel, and the resident aliens from both the country of Israel and the country of Judah, celebrated. It was a great celebration in Jerusalem, unequaled since the days of Solomon son of David king of Israel.</w:t>
             </w:r>
           </w:p>
         </w:tc>
@@ -22238,7 +22238,7 @@
               <w:rPr>
                 <w:sz w:val="18"/>
               </w:rPr>
-              <w:t>유다 왕 히스기야가 회중에게 제물로 수소 1,000마리와 양 7,000마리를 줬고, 지도자들도 회중에게 수소 1,000마리와 양 10,000마리를 줬어. 많은 제사장이 자신을 거룩하게 했지. 유다 온 회중, 제사장들, 레위인들, 이스라엘에서 온 회중, 이스라엘 땅과 유다 땅의 거류 외국인들까지 모두 축하했어. 예루살렘에 큰 축제였지. 이스라엘 왕 다윗의 아들 솔로몬 시대 이후 비할 데 없는.</w:t>
+              <w:t>유다 왕 히스기야가 회중에게 제물로 수소 1,000마리와 양 7,000마리를 줬고, 지도자들도 회중에게 수소 1,000마리와 양 10,000마리를 줬어. 많은 제사장이 자신을 거룩하게 구별했지. 다 자격을 갖추고 잘 준비된 사람들이었어. 유다 온 회중, 제사장들, 레위인들, 이스라엘에서 온 회중, 이스라엘 땅과 유다 땅의 거류 외국인들까지 모두 축하했어. 예루살렘에 큰 축제였지. 이스라엘 왕 다윗의 아들 솔로몬 시대 이후 비할 데 없는.</w:t>
             </w:r>
           </w:p>
         </w:tc>
@@ -22921,7 +22921,7 @@
               <w:rPr>
                 <w:sz w:val="18"/>
               </w:rPr>
-              <w:t>Hezekiah then ordered storerooms to be prepared in The Temple of God. When they were ready, they brought in all the offerings of tithes and sacred gifts. They put Conaniah the Levite in charge, with his brother Shimei as assistant. They were joined by their colleagues Jehiel, Azaziah, Nahath, Asahel, Jerimoth, Jozabad, Eliel, Ismakiah, Mahath, and Benaiah. These were the supervisors under Conaniah and Shimei his brother, as directed by King Hezekiah and Azariah the chief priest in The Temple of God. Kore son of Imnah the Levite, the guard at the East Gate, was in charge of the Freewill-Offerings of God and for distributing the contributions made to God and the consecrated gifts. Faithful assistants under him were Eden, Miniamin, Jeshua, Shemaiah, Amariah, and Shecaniah. They were to distribute the rations in all the priestly towns to their brothers — young and old, in their various divisions. In addition, they distributed to males thirty years and older — to everyone who entered The Temple of God to carry out their daily duties according to their work and their divisions — the priests enrolled by families and the Levites twenty years and older, by their duties and divisions. The official family tree included everyone — children, wives, sons, daughters — the whole extended family; they had to be consecrated and set apart for holy work.</w:t>
+              <w:t>Hezekiah then ordered storerooms to be prepared in The Temple of God. When they were ready, they brought in all the offerings of tithes and sacred gifts. They put Conaniah the Levite in charge, with his brother Shimei as assistant. They were joined by their colleagues Jehiel, Azaziah, Nahath, Asahel, Jerimoth, Jozabad, Eliel, Ismakiah, Mahath, and Benaiah. These were the supervisors under Conaniah and Shimei his brother, as directed by King Hezekiah and Azariah the chief priest in The Temple of God. Kore son of Imnah the Levite, the guard at the East Gate, was in charge of the Freewill-Offerings of God and for distributing the contributions made to God and the consecrated gifts. Faithful assistants under him were Eden, Miniamin, Jeshua, Shemaiah, Amariah, and Shecaniah. They were to distribute the rations in all the priestly towns to their brothers — young and old, in their various divisions. In addition, they distributed to males thirty years and older — to everyone who entered The Temple of God to carry out their daily duties according to their work and their divisions — the priests enrolled by families and the Levites twenty years and older, by their duties and divisions. The official family tree included everyone — children, wives, sons, daughters — the whole extended family; they had to be consecrated and set apart for holy work. Their dedication was total — they brought themselves and their gifts to worship with passion, and no one was left out.</w:t>
             </w:r>
           </w:p>
         </w:tc>
@@ -22944,7 +22944,7 @@
               <w:rPr>
                 <w:sz w:val="18"/>
               </w:rPr>
-              <w:t>그러자 히스기야가 하나님의 성전에 저장실을 준비하라 명령했어. 준비되자 십일조 제물과 거룩한 예물을 모두 들여왔지. 레위인 고나냐를 책임자로 세우고 동생 시므이를 보좌로 삼았어. 동료들 여히엘, 아사시야, 나핫, 아사헬, 여리못, 요사밧, 엘리엘, 이스마갸, 마핫, 브나야가 합류했지. 이들은 히스기야 왕과 하나님의 성전의 대제사장 아사랴의 지시대로 고나냐와 그 동생 시므이 아래 감독들이었어. 동문 파수꾼 레위인 임나의 아들 고레가 하나님께 드리는 자원 예물을 맡아 하나님께 드린 헌금과 거룩하게 구별된 예물을 분배했지. 그 아래 신실한 보좌들은 에덴, 미냐민, 예수아, 스마야, 아마랴, 스가냐였어. 제사장 성읍들에서 형제들에게 — 어린아이부터 어른까지, 각 부대별로 — 몫을 분배하도록. 게다가 30살 이상 남자들에게도 분배했지. 하나님의 성전에 들어가 자기 일과 부대별로 매일 직무를 수행하는 모든 이에게 — 제사장은 가문별로 등록되고 레위인은 20살 이상, 직무와 부대별로. 공식 족보에는 모두가 포함됐어. 아이들, 아내들, 아들들, 딸들 — 온 대가족. 거룩하게 구별되어 거룩한 일을 위해 따로 세워져야 했거든.</w:t>
+              <w:t>그러자 히스기야가 하나님의 성전에 저장실을 준비하라 명령했어. 준비되자 십일조 제물과 거룩한 예물을 모두 들여왔지. 레위인 고나냐를 책임자로 세우고 동생 시므이를 보좌로 삼았어. 동료들 여히엘, 아사시야, 나핫, 아사헬, 여리못, 요사밧, 엘리엘, 이스마갸, 마핫, 브나야가 합류했지. 이들은 히스기야 왕과 하나님의 성전의 대제사장 아사랴의 지시대로 고나냐와 그 동생 시므이 아래 감독들이었어. 동문 파수꾼 레위인 임나의 아들 고레가 하나님께 드리는 자원 예물을 맡아 하나님께 드린 헌금과 거룩하게 구별된 예물을 분배했지. 그 아래 신실한 보좌들은 에덴, 미냐민, 예수아, 스마야, 아마랴, 스가냐였어. 제사장 성읍들에서 형제들에게 — 어린아이부터 어른까지, 각 부대별로 — 몫을 분배하도록. 게다가 30살 이상 남자들에게도 분배했지. 하나님의 성전에 들어가 자기 일과 부대별로 매일 직무를 수행하는 모든 이에게 — 제사장은 가문별로 등록되고 레위인은 20살 이상, 직무와 부대별로. 공식 족보에는 모두가 포함됐어. 아이들, 아내들, 아들들, 딸들 — 온 대가족. 거룩하게 구별되어 거룩한 일을 위해 따로 세워져야 했거든. 예배에 몸과 예물을 바치는 그들의 열정은 대단했어. 한 사람도 빠짐없이.</w:t>
             </w:r>
           </w:p>
         </w:tc>
@@ -24368,7 +24368,7 @@
               <w:rPr>
                 <w:sz w:val="18"/>
               </w:rPr>
-              <w:t>Manasseh was twelve years old when he became king and ruled in Jerusalem for fifty-five years. In God's eyes he lived an evil life, obedient to the tabooed practices of the nations that God had driven out of the country before the arrival of Israel. He rebuilt the neighborhood sex-and-religion shrines that his father Hezekiah had demolished, erected altars to Baal, put up Asherah poles, and worshiped at the cosmic shrines, courted the whole cosmic zoo. He even built altars to the gods of the cosmos in The Temple of God, the very place that God had set aside for worship. Under the slogan “God's Temple in Jerusalem is the place of worship” he built altars for the gods of the cosmos in both courtyards of The Temple of God. He burned his sons as sacrifices in the Valley of Ben Hinnom. He practiced witchcraft and fortunetelling, and operated with a black cat in his lap — a dabbler in the occult. He did a lot that was evil in God's eyes, and, needless to say, it made God angry.</w:t>
+              <w:t>Manasseh was twelve years old when he became king and ruled in Jerusalem for fifty-five years. In God's eyes he lived an evil life, obedient to the tabooed practices of the nations that God had driven out of the country before the arrival of Israel. He rebuilt the neighborhood sex-and-religion shrines that his father Hezekiah had demolished, erected altars to Baal, put up Asherah poles, and worshiped at the cosmic shrines, courted the whole cosmic zoo. He even built altars to the gods of the cosmos in The Temple of God, the very place that God had set aside for worship. Under the slogan “God's Temple in Jerusalem is the place of worship” he built altars for the gods of the cosmos in both courtyards of The Temple of God. He burned his sons as sacrifices in the Valley of Ben Hinnom. He practiced witchcraft and fortunetelling, held séances and consulted spirits from the underworld, and operated with a black cat in his lap — a dabbler in the occult. He did a lot that was evil in God's eyes, and, needless to say, it made God angry.</w:t>
             </w:r>
           </w:p>
         </w:tc>
@@ -24391,7 +24391,7 @@
               <w:rPr>
                 <w:sz w:val="18"/>
               </w:rPr>
-              <w:t>므낫세는 왕이 될 때 12살이었고 예루살렘에서 55년 동안 다스렸어. 하나님 눈에 악한 삶을 살았어. 이스라엘이 오기 전 하나님이 그 땅에서 쫓아내신 민족들의 금기된 관행을 따라서. 아버지 히스기야가 헐어버린 동네 음란 종교 산당을 다시 짓고, 바알에게 제단을 세우고, 아세라 목상을 세우고, 우주 신전에서 예배하며 온 우주의 동물원을 구애했지. 하나님의 예배를 위해 따로 두신 바로 그곳, 하나님의 성전 안에 우주의 신들에게 제단까지 세웠어. “예루살렘의 하나님의 성전이 예배의 곳”이라는 구호 아래 하나님의 성전 두 뜰에 우주의 신들을 위한 제단을 세웠지. 벤힌놈 골짜기에서 아들들을 불에 제물로 태웠어. 마술과 점술을 행하고, 무릎에 검은 고양이를 얹고 다녔지. 오컬트에 손댄 거야. 하나님 눈에 악한 일을 많이 했고, 말할 것도 없이 하나님을 진노하게 했지.</w:t>
+              <w:t>므낫세는 왕이 될 때 12살이었고 예루살렘에서 55년 동안 다스렸어. 하나님 눈에 악한 삶을 살았어. 이스라엘이 오기 전 하나님이 그 땅에서 쫓아내신 민족들의 금기된 관행을 따라서. 아버지 히스기야가 헐어버린 동네 음란 종교 산당을 다시 짓고, 바알에게 제단을 세우고, 아세라 목상을 세우고, 우주 신전에서 예배하며 온 우주의 동물원을 구애했지. 하나님의 예배를 위해 따로 두신 바로 그곳, 하나님의 성전 안에 우주의 신들에게 제단까지 세웠어. “예루살렘의 하나님의 성전이 예배의 곳”이라는 구호 아래 하나님의 성전 두 뜰에 우주의 신들을 위한 제단을 세웠지. 벤힌놈 골짜기에서 아들들을 불에 제물로 태웠어. 마술과 점술을 행하고, 죽은 자의 영을 불러내는 강령술까지 하고, 무릎에 검은 고양이를 얹고 다녔지. 오컬트에 손댄 거야. 하나님 눈에 악한 일을 많이 했고, 말할 것도 없이 하나님을 진노하게 했지.</w:t>
             </w:r>
           </w:p>
         </w:tc>
@@ -26207,7 +26207,7 @@
               <w:rPr>
                 <w:sz w:val="18"/>
               </w:rPr>
-              <w:t>Josiah provided the master of ceremonies for the people — 30,000 lambs and goats and 3,000 bulls from the king's own herds for the Passover sacrifices. The king's officials were just as generous — they gave a hundred bulls, besides the 7,600 lambs and goats, to the priests for the Passover offerings; and Hilkiah, Zechariah, and Jehiel, leaders in The Temple of God, gave 2,600 lambs and goats and 300 bulls to the priests for the Passover offerings; and Conaniah, Shemaiah and Nethanel his brothers, along with the Levitical chiefs Hashabiah, Jeiel, and Jozabad, gave 5,000 lambs and goats and 500 bulls to the Levites for the Passover offerings.</w:t>
+              <w:t>Josiah personally donated 30,000 sheep, lambs, and goats and 3,000 bulls from his own herds for the Passover sacrifices — everything needed for the celebration was there. The king's officials were just as generous — they gave a hundred bulls, besides the 7,600 lambs and goats, to the priests for the Passover offerings; and Hilkiah, Zechariah, and Jehiel, leaders in The Temple of God, gave 2,600 lambs and goats and 300 bulls to the priests for the Passover offerings; and Conaniah, Shemaiah and Nethanel his brothers, along with the Levitical chiefs Hashabiah, Jeiel, and Jozabad, gave 5,000 lambs and goats and 500 bulls to the Levites for the Passover offerings.</w:t>
             </w:r>
           </w:p>
         </w:tc>
@@ -26230,7 +26230,7 @@
               <w:rPr>
                 <w:sz w:val="18"/>
               </w:rPr>
-              <w:t>요시야가 백성을 위한 행사 총괄자에게 제공했어. 왕의 가축 중에서 유월절 제물로 어린양과 염소 30,000마리와 수소 3,000마리. 왕의 신하들도 그만큼 너그러웠지. 유월절 제물로 제사장들에게 어린양과 염소 7,600마리 외에 수소 100마리를 줬어. 하나님의 성전의 지도자들 힐기야, 스가랴, 여히엘이 제사장들에게 유월절 제물로 어린양과 염소 2,600마리와 수소 300마리를 줬고, 고나냐와 그 형제 스마야와 느다넬, 그리고 레위 지휘자들인 하사뱌, 여이엘, 요사밧이 레위인들에게 유월절 제물로 어린양과 염소 5,000마리와 수소 500마리를 줬지.</w:t>
+              <w:t>요시야가 직접 내놓았어. 자기 가축 중에서 유월절 제물로 양과 어린양과 염소 30,000마리, 수소 3,000마리. 잔치에 필요한 건 다 있었지. 왕의 신하들도 그만큼 너그러웠지. 유월절 제물로 제사장들에게 어린양과 염소 7,600마리 외에 수소 100마리를 줬어. 하나님의 성전의 지도자들 힐기야, 스가랴, 여히엘이 제사장들에게 유월절 제물로 어린양과 염소 2,600마리와 수소 300마리를 줬고, 고나냐와 그 형제 스마야와 느다넬, 그리고 레위 지휘자들인 하사뱌, 여이엘, 요사밧이 레위인들에게 유월절 제물로 어린양과 염소 5,000마리와 수소 500마리를 줬지.</w:t>
             </w:r>
           </w:p>
         </w:tc>

</xml_diff>